<commit_message>
Date: 18 Aug 2026
</commit_message>
<xml_diff>
--- a/Playwright Notes.docx
+++ b/Playwright Notes.docx
@@ -69,114 +69,57 @@
         </w:rPr>
         <w:t xml:space="preserve">1. </w:t>
       </w:r>
-      <w:proofErr w:type="gramStart"/>
-      <w:r>
-        <w:rPr>
-          <w:sz w:val="28"/>
-          <w:szCs w:val="24"/>
-        </w:rPr>
-        <w:t>browser</w:t>
-      </w:r>
-      <w:proofErr w:type="gramEnd"/>
-      <w:r>
-        <w:rPr>
-          <w:sz w:val="28"/>
-          <w:szCs w:val="24"/>
-        </w:rPr>
-        <w:t>: will execute script on original browser instance (Chrome)</w:t>
-      </w:r>
-    </w:p>
-    <w:p>
-      <w:pPr>
-        <w:rPr>
-          <w:sz w:val="28"/>
-          <w:szCs w:val="24"/>
-        </w:rPr>
-      </w:pPr>
-      <w:r>
-        <w:rPr>
-          <w:sz w:val="28"/>
-          <w:szCs w:val="24"/>
-        </w:rPr>
-        <w:t xml:space="preserve">2. </w:t>
-      </w:r>
-      <w:proofErr w:type="gramStart"/>
-      <w:r>
-        <w:rPr>
-          <w:sz w:val="28"/>
-          <w:szCs w:val="24"/>
-        </w:rPr>
-        <w:t>browser</w:t>
-      </w:r>
-      <w:proofErr w:type="gramEnd"/>
-      <w:r>
-        <w:rPr>
-          <w:sz w:val="28"/>
-          <w:szCs w:val="24"/>
-        </w:rPr>
-        <w:t xml:space="preserve"> context: multiple browsers for multiple users</w:t>
-      </w:r>
-    </w:p>
-    <w:p>
-      <w:pPr>
-        <w:rPr>
-          <w:sz w:val="28"/>
-          <w:szCs w:val="24"/>
-        </w:rPr>
-      </w:pPr>
-      <w:r>
-        <w:rPr>
-          <w:sz w:val="28"/>
-          <w:szCs w:val="24"/>
-        </w:rPr>
-        <w:t xml:space="preserve">3. </w:t>
-      </w:r>
-      <w:proofErr w:type="gramStart"/>
-      <w:r>
-        <w:rPr>
-          <w:sz w:val="28"/>
-          <w:szCs w:val="24"/>
-        </w:rPr>
-        <w:t>page</w:t>
-      </w:r>
-      <w:proofErr w:type="gramEnd"/>
-      <w:r>
-        <w:rPr>
-          <w:sz w:val="28"/>
-          <w:szCs w:val="24"/>
-        </w:rPr>
-        <w:t xml:space="preserve">: for single tab / browser </w:t>
-      </w:r>
-    </w:p>
-    <w:p>
-      <w:pPr>
-        <w:rPr>
-          <w:sz w:val="28"/>
-          <w:szCs w:val="24"/>
-        </w:rPr>
-      </w:pPr>
-      <w:r>
-        <w:rPr>
-          <w:sz w:val="28"/>
-          <w:szCs w:val="24"/>
-        </w:rPr>
-        <w:t xml:space="preserve">4. </w:t>
-      </w:r>
-      <w:proofErr w:type="gramStart"/>
-      <w:r>
-        <w:rPr>
-          <w:sz w:val="28"/>
-          <w:szCs w:val="24"/>
-        </w:rPr>
-        <w:t>request</w:t>
-      </w:r>
-      <w:proofErr w:type="gramEnd"/>
-      <w:r>
-        <w:rPr>
-          <w:sz w:val="28"/>
-          <w:szCs w:val="24"/>
-        </w:rPr>
-        <w:t>: API testing</w:t>
+      <w:r>
+        <w:rPr>
+          <w:sz w:val="28"/>
+          <w:szCs w:val="24"/>
+        </w:rPr>
+        <w:t>browser: will execute script on original browser instance (Chrome)</w:t>
+      </w:r>
+    </w:p>
+    <w:p>
+      <w:pPr>
+        <w:rPr>
+          <w:sz w:val="28"/>
+          <w:szCs w:val="24"/>
+        </w:rPr>
+      </w:pPr>
+      <w:r>
+        <w:rPr>
+          <w:sz w:val="28"/>
+          <w:szCs w:val="24"/>
+        </w:rPr>
+        <w:t>2. browser context: multiple browsers for multiple users</w:t>
+      </w:r>
+    </w:p>
+    <w:p>
+      <w:pPr>
+        <w:rPr>
+          <w:sz w:val="28"/>
+          <w:szCs w:val="24"/>
+        </w:rPr>
+      </w:pPr>
+      <w:r>
+        <w:rPr>
+          <w:sz w:val="28"/>
+          <w:szCs w:val="24"/>
+        </w:rPr>
+        <w:t xml:space="preserve">3. page: for single tab / browser </w:t>
+      </w:r>
+    </w:p>
+    <w:p>
+      <w:pPr>
+        <w:rPr>
+          <w:sz w:val="28"/>
+          <w:szCs w:val="24"/>
+        </w:rPr>
+      </w:pPr>
+      <w:r>
+        <w:rPr>
+          <w:sz w:val="28"/>
+          <w:szCs w:val="24"/>
+        </w:rPr>
+        <w:t>4. request: API testing</w:t>
       </w:r>
     </w:p>
     <w:p>
@@ -216,23 +159,13 @@
           <w:lang w:eastAsia="en-US"/>
         </w:rPr>
       </w:pPr>
-      <w:proofErr w:type="spellStart"/>
       <w:r>
         <w:rPr>
           <w:rFonts w:eastAsiaTheme="minorHAnsi"/>
           <w:sz w:val="28"/>
           <w:szCs w:val="24"/>
         </w:rPr>
-        <w:t>goto</w:t>
-      </w:r>
-      <w:proofErr w:type="spellEnd"/>
-      <w:r>
-        <w:rPr>
-          <w:rFonts w:eastAsiaTheme="minorHAnsi"/>
-          <w:sz w:val="28"/>
-          <w:szCs w:val="24"/>
-        </w:rPr>
-        <w:t xml:space="preserve">() </w:t>
+        <w:t xml:space="preserve">goto() </w:t>
       </w:r>
       <w:r>
         <w:rPr>
@@ -316,25 +249,14 @@
           <w:lang w:eastAsia="en-US"/>
         </w:rPr>
       </w:pPr>
-      <w:proofErr w:type="spellStart"/>
-      <w:r>
-        <w:rPr>
-          <w:rFonts w:asciiTheme="minorHAnsi" w:eastAsiaTheme="minorHAnsi" w:hAnsiTheme="minorHAnsi" w:cs="Mangal"/>
-          <w:sz w:val="28"/>
-          <w:szCs w:val="24"/>
-          <w:lang w:eastAsia="en-US"/>
-        </w:rPr>
-        <w:t>url</w:t>
-      </w:r>
-      <w:proofErr w:type="spellEnd"/>
-      <w:r>
-        <w:rPr>
-          <w:rFonts w:asciiTheme="minorHAnsi" w:eastAsiaTheme="minorHAnsi" w:hAnsiTheme="minorHAnsi" w:cs="Mangal"/>
-          <w:sz w:val="28"/>
-          <w:szCs w:val="24"/>
-          <w:lang w:eastAsia="en-US"/>
-        </w:rPr>
-        <w:t xml:space="preserve">() </w:t>
+      <w:r>
+        <w:rPr>
+          <w:rFonts w:asciiTheme="minorHAnsi" w:eastAsiaTheme="minorHAnsi" w:hAnsiTheme="minorHAnsi" w:cs="Mangal"/>
+          <w:sz w:val="28"/>
+          <w:szCs w:val="24"/>
+          <w:lang w:eastAsia="en-US"/>
+        </w:rPr>
+        <w:t xml:space="preserve">url() </w:t>
       </w:r>
       <w:r>
         <w:rPr>
@@ -357,109 +279,495 @@
     </w:p>
     <w:p>
       <w:pPr>
-        <w:rPr>
-          <w:sz w:val="28"/>
-          <w:szCs w:val="24"/>
-        </w:rPr>
-      </w:pPr>
-    </w:p>
-    <w:p>
-      <w:pPr>
-        <w:rPr>
-          <w:sz w:val="28"/>
-          <w:szCs w:val="24"/>
-        </w:rPr>
-      </w:pPr>
-    </w:p>
-    <w:p>
-      <w:pPr>
         <w:pStyle w:val="ListParagraph"/>
-        <w:rPr>
-          <w:rFonts w:asciiTheme="minorHAnsi" w:eastAsiaTheme="minorHAnsi" w:hAnsiTheme="minorHAnsi" w:cs="Mangal"/>
-          <w:sz w:val="28"/>
-          <w:szCs w:val="24"/>
-          <w:lang w:eastAsia="en-US"/>
-        </w:rPr>
-      </w:pPr>
-      <w:r>
-        <w:rPr>
-          <w:rFonts w:asciiTheme="minorHAnsi" w:eastAsiaTheme="minorHAnsi" w:hAnsiTheme="minorHAnsi" w:cs="Mangal"/>
-          <w:sz w:val="28"/>
-          <w:szCs w:val="24"/>
-          <w:lang w:eastAsia="en-US"/>
-        </w:rPr>
-        <w:t>Assertion is the validation for your test case</w:t>
+        <w:numPr>
+          <w:ilvl w:val="0"/>
+          <w:numId w:val="2"/>
+        </w:numPr>
+        <w:rPr>
+          <w:rFonts w:asciiTheme="minorHAnsi" w:eastAsiaTheme="minorHAnsi" w:hAnsiTheme="minorHAnsi" w:cs="Mangal"/>
+          <w:sz w:val="28"/>
+          <w:szCs w:val="24"/>
+          <w:lang w:eastAsia="en-US"/>
+        </w:rPr>
+      </w:pPr>
+      <w:r>
+        <w:rPr>
+          <w:rFonts w:asciiTheme="minorHAnsi" w:eastAsiaTheme="minorHAnsi" w:hAnsiTheme="minorHAnsi" w:cs="Mangal"/>
+          <w:sz w:val="28"/>
+          <w:szCs w:val="24"/>
+          <w:lang w:eastAsia="en-US"/>
+        </w:rPr>
+        <w:t xml:space="preserve">goBack() </w:t>
+      </w:r>
+      <w:r>
+        <w:rPr>
+          <w:rFonts w:asciiTheme="minorHAnsi" w:eastAsiaTheme="minorHAnsi" w:hAnsiTheme="minorHAnsi" w:cs="Mangal"/>
+          <w:sz w:val="28"/>
+          <w:szCs w:val="24"/>
+          <w:lang w:eastAsia="en-US"/>
+        </w:rPr>
+        <w:sym w:font="Wingdings" w:char="F0E0"/>
+      </w:r>
+      <w:r>
+        <w:rPr>
+          <w:rFonts w:asciiTheme="minorHAnsi" w:eastAsiaTheme="minorHAnsi" w:hAnsiTheme="minorHAnsi" w:cs="Mangal"/>
+          <w:sz w:val="28"/>
+          <w:szCs w:val="24"/>
+          <w:lang w:eastAsia="en-US"/>
+        </w:rPr>
+        <w:t xml:space="preserve"> Will navigate one level back</w:t>
       </w:r>
     </w:p>
     <w:p>
       <w:pPr>
         <w:pStyle w:val="ListParagraph"/>
-        <w:rPr>
-          <w:rFonts w:asciiTheme="minorHAnsi" w:eastAsiaTheme="minorHAnsi" w:hAnsiTheme="minorHAnsi" w:cs="Mangal"/>
-          <w:sz w:val="28"/>
-          <w:szCs w:val="24"/>
-          <w:lang w:eastAsia="en-US"/>
-        </w:rPr>
-      </w:pPr>
-      <w:r>
-        <w:rPr>
-          <w:rFonts w:asciiTheme="minorHAnsi" w:eastAsiaTheme="minorHAnsi" w:hAnsiTheme="minorHAnsi" w:cs="Mangal"/>
-          <w:sz w:val="28"/>
-          <w:szCs w:val="24"/>
-          <w:lang w:eastAsia="en-US"/>
-        </w:rPr>
-        <w:t>Types:</w:t>
-      </w:r>
-    </w:p>
-    <w:p>
-      <w:pPr>
-        <w:pStyle w:val="ListParagraph"/>
-        <w:rPr>
-          <w:rFonts w:asciiTheme="minorHAnsi" w:eastAsiaTheme="minorHAnsi" w:hAnsiTheme="minorHAnsi" w:cs="Mangal"/>
-          <w:sz w:val="28"/>
-          <w:szCs w:val="24"/>
-          <w:lang w:eastAsia="en-US"/>
-        </w:rPr>
-      </w:pPr>
-      <w:r>
-        <w:rPr>
-          <w:rFonts w:asciiTheme="minorHAnsi" w:eastAsiaTheme="minorHAnsi" w:hAnsiTheme="minorHAnsi" w:cs="Mangal"/>
-          <w:sz w:val="28"/>
-          <w:szCs w:val="24"/>
-          <w:lang w:eastAsia="en-US"/>
-        </w:rPr>
-        <w:t>1. Hard Assertion</w:t>
-      </w:r>
-    </w:p>
-    <w:p>
-      <w:pPr>
-        <w:pStyle w:val="ListParagraph"/>
-        <w:rPr>
-          <w:rFonts w:asciiTheme="minorHAnsi" w:eastAsiaTheme="minorHAnsi" w:hAnsiTheme="minorHAnsi" w:cs="Mangal"/>
-          <w:sz w:val="28"/>
-          <w:szCs w:val="24"/>
-          <w:lang w:eastAsia="en-US"/>
-        </w:rPr>
-      </w:pPr>
-      <w:r>
-        <w:rPr>
-          <w:rFonts w:asciiTheme="minorHAnsi" w:eastAsiaTheme="minorHAnsi" w:hAnsiTheme="minorHAnsi" w:cs="Mangal"/>
-          <w:sz w:val="28"/>
-          <w:szCs w:val="24"/>
-          <w:lang w:eastAsia="en-US"/>
-        </w:rPr>
-        <w:t>2. Soft Assertion</w:t>
-      </w:r>
-    </w:p>
-    <w:p>
-      <w:pPr>
-        <w:rPr>
-          <w:sz w:val="28"/>
-          <w:szCs w:val="24"/>
-        </w:rPr>
-      </w:pPr>
+        <w:numPr>
+          <w:ilvl w:val="0"/>
+          <w:numId w:val="2"/>
+        </w:numPr>
+        <w:rPr>
+          <w:rFonts w:asciiTheme="minorHAnsi" w:eastAsiaTheme="minorHAnsi" w:hAnsiTheme="minorHAnsi" w:cs="Mangal"/>
+          <w:sz w:val="28"/>
+          <w:szCs w:val="24"/>
+          <w:lang w:eastAsia="en-US"/>
+        </w:rPr>
+      </w:pPr>
+      <w:r>
+        <w:rPr>
+          <w:rFonts w:asciiTheme="minorHAnsi" w:eastAsiaTheme="minorHAnsi" w:hAnsiTheme="minorHAnsi" w:cs="Mangal"/>
+          <w:sz w:val="28"/>
+          <w:szCs w:val="24"/>
+          <w:lang w:eastAsia="en-US"/>
+        </w:rPr>
+        <w:t>goForwa</w:t>
+      </w:r>
+      <w:r>
+        <w:rPr>
+          <w:rFonts w:asciiTheme="minorHAnsi" w:eastAsiaTheme="minorHAnsi" w:hAnsiTheme="minorHAnsi" w:cs="Mangal"/>
+          <w:sz w:val="28"/>
+          <w:szCs w:val="24"/>
+          <w:lang w:eastAsia="en-US"/>
+        </w:rPr>
+        <w:t xml:space="preserve">rd() </w:t>
+      </w:r>
+      <w:r>
+        <w:rPr>
+          <w:rFonts w:asciiTheme="minorHAnsi" w:eastAsiaTheme="minorHAnsi" w:hAnsiTheme="minorHAnsi" w:cs="Mangal"/>
+          <w:sz w:val="28"/>
+          <w:szCs w:val="24"/>
+          <w:lang w:eastAsia="en-US"/>
+        </w:rPr>
+        <w:sym w:font="Wingdings" w:char="F0E0"/>
+      </w:r>
+      <w:r>
+        <w:rPr>
+          <w:rFonts w:asciiTheme="minorHAnsi" w:eastAsiaTheme="minorHAnsi" w:hAnsiTheme="minorHAnsi" w:cs="Mangal"/>
+          <w:sz w:val="28"/>
+          <w:szCs w:val="24"/>
+          <w:lang w:eastAsia="en-US"/>
+        </w:rPr>
+        <w:t xml:space="preserve"> Will navigate one level forwa</w:t>
+      </w:r>
       <w:bookmarkStart w:id="0" w:name="_GoBack"/>
       <w:bookmarkEnd w:id="0"/>
+      <w:r>
+        <w:rPr>
+          <w:rFonts w:asciiTheme="minorHAnsi" w:eastAsiaTheme="minorHAnsi" w:hAnsiTheme="minorHAnsi" w:cs="Mangal"/>
+          <w:sz w:val="28"/>
+          <w:szCs w:val="24"/>
+          <w:lang w:eastAsia="en-US"/>
+        </w:rPr>
+        <w:t>rd</w:t>
+      </w:r>
+    </w:p>
+    <w:p>
+      <w:pPr>
+        <w:pStyle w:val="ListParagraph"/>
+        <w:numPr>
+          <w:ilvl w:val="0"/>
+          <w:numId w:val="2"/>
+        </w:numPr>
+        <w:rPr>
+          <w:rFonts w:asciiTheme="minorHAnsi" w:eastAsiaTheme="minorHAnsi" w:hAnsiTheme="minorHAnsi" w:cs="Mangal"/>
+          <w:sz w:val="28"/>
+          <w:szCs w:val="24"/>
+          <w:lang w:eastAsia="en-US"/>
+        </w:rPr>
+      </w:pPr>
+      <w:r>
+        <w:rPr>
+          <w:rFonts w:asciiTheme="minorHAnsi" w:eastAsiaTheme="minorHAnsi" w:hAnsiTheme="minorHAnsi" w:cs="Mangal"/>
+          <w:sz w:val="28"/>
+          <w:szCs w:val="24"/>
+          <w:lang w:eastAsia="en-US"/>
+        </w:rPr>
+        <w:t xml:space="preserve">reload() </w:t>
+      </w:r>
+      <w:r>
+        <w:rPr>
+          <w:rFonts w:asciiTheme="minorHAnsi" w:eastAsiaTheme="minorHAnsi" w:hAnsiTheme="minorHAnsi" w:cs="Mangal"/>
+          <w:sz w:val="28"/>
+          <w:szCs w:val="24"/>
+          <w:lang w:eastAsia="en-US"/>
+        </w:rPr>
+        <w:sym w:font="Wingdings" w:char="F0E0"/>
+      </w:r>
+      <w:r>
+        <w:rPr>
+          <w:rFonts w:asciiTheme="minorHAnsi" w:eastAsiaTheme="minorHAnsi" w:hAnsiTheme="minorHAnsi" w:cs="Mangal"/>
+          <w:sz w:val="28"/>
+          <w:szCs w:val="24"/>
+          <w:lang w:eastAsia="en-US"/>
+        </w:rPr>
+        <w:t xml:space="preserve"> Will refresh the page</w:t>
+      </w:r>
+    </w:p>
+    <w:p>
+      <w:pPr>
+        <w:rPr>
+          <w:sz w:val="28"/>
+          <w:szCs w:val="24"/>
+        </w:rPr>
+      </w:pPr>
+    </w:p>
+    <w:p>
+      <w:pPr>
+        <w:rPr>
+          <w:sz w:val="28"/>
+          <w:szCs w:val="24"/>
+        </w:rPr>
+      </w:pPr>
+    </w:p>
+    <w:p>
+      <w:pPr>
+        <w:pStyle w:val="ListParagraph"/>
+        <w:rPr>
+          <w:rFonts w:asciiTheme="minorHAnsi" w:eastAsiaTheme="minorHAnsi" w:hAnsiTheme="minorHAnsi" w:cs="Mangal"/>
+          <w:sz w:val="28"/>
+          <w:szCs w:val="24"/>
+          <w:lang w:eastAsia="en-US"/>
+        </w:rPr>
+      </w:pPr>
+      <w:r>
+        <w:rPr>
+          <w:rFonts w:asciiTheme="minorHAnsi" w:eastAsiaTheme="minorHAnsi" w:hAnsiTheme="minorHAnsi" w:cs="Mangal"/>
+          <w:sz w:val="28"/>
+          <w:szCs w:val="24"/>
+          <w:lang w:eastAsia="en-US"/>
+        </w:rPr>
+        <w:t>Assertion is the validation for your test case</w:t>
+      </w:r>
+    </w:p>
+    <w:p>
+      <w:pPr>
+        <w:pStyle w:val="ListParagraph"/>
+        <w:rPr>
+          <w:rFonts w:asciiTheme="minorHAnsi" w:eastAsiaTheme="minorHAnsi" w:hAnsiTheme="minorHAnsi" w:cs="Mangal"/>
+          <w:sz w:val="28"/>
+          <w:szCs w:val="24"/>
+          <w:lang w:eastAsia="en-US"/>
+        </w:rPr>
+      </w:pPr>
+      <w:r>
+        <w:rPr>
+          <w:rFonts w:asciiTheme="minorHAnsi" w:eastAsiaTheme="minorHAnsi" w:hAnsiTheme="minorHAnsi" w:cs="Mangal"/>
+          <w:sz w:val="28"/>
+          <w:szCs w:val="24"/>
+          <w:lang w:eastAsia="en-US"/>
+        </w:rPr>
+        <w:t>Types:</w:t>
+      </w:r>
+    </w:p>
+    <w:p>
+      <w:pPr>
+        <w:pStyle w:val="ListParagraph"/>
+        <w:rPr>
+          <w:rFonts w:asciiTheme="minorHAnsi" w:eastAsiaTheme="minorHAnsi" w:hAnsiTheme="minorHAnsi" w:cs="Mangal"/>
+          <w:sz w:val="28"/>
+          <w:szCs w:val="24"/>
+          <w:lang w:eastAsia="en-US"/>
+        </w:rPr>
+      </w:pPr>
+      <w:r>
+        <w:rPr>
+          <w:rFonts w:asciiTheme="minorHAnsi" w:eastAsiaTheme="minorHAnsi" w:hAnsiTheme="minorHAnsi" w:cs="Mangal"/>
+          <w:sz w:val="28"/>
+          <w:szCs w:val="24"/>
+          <w:lang w:eastAsia="en-US"/>
+        </w:rPr>
+        <w:t>1. Hard Assertion</w:t>
+      </w:r>
+    </w:p>
+    <w:p>
+      <w:pPr>
+        <w:pStyle w:val="ListParagraph"/>
+        <w:rPr>
+          <w:rFonts w:asciiTheme="minorHAnsi" w:eastAsiaTheme="minorHAnsi" w:hAnsiTheme="minorHAnsi" w:cs="Mangal"/>
+          <w:sz w:val="28"/>
+          <w:szCs w:val="24"/>
+          <w:lang w:eastAsia="en-US"/>
+        </w:rPr>
+      </w:pPr>
+      <w:r>
+        <w:rPr>
+          <w:rFonts w:asciiTheme="minorHAnsi" w:eastAsiaTheme="minorHAnsi" w:hAnsiTheme="minorHAnsi" w:cs="Mangal"/>
+          <w:sz w:val="28"/>
+          <w:szCs w:val="24"/>
+          <w:lang w:eastAsia="en-US"/>
+        </w:rPr>
+        <w:t>2. Soft Assertion</w:t>
+      </w:r>
+    </w:p>
+    <w:p>
+      <w:pPr>
+        <w:rPr>
+          <w:sz w:val="28"/>
+          <w:szCs w:val="24"/>
+        </w:rPr>
+      </w:pPr>
+    </w:p>
+    <w:p>
+      <w:pPr>
+        <w:rPr>
+          <w:b/>
+          <w:bCs/>
+          <w:sz w:val="28"/>
+          <w:szCs w:val="24"/>
+        </w:rPr>
+      </w:pPr>
+      <w:r>
+        <w:rPr>
+          <w:b/>
+          <w:bCs/>
+          <w:sz w:val="28"/>
+          <w:szCs w:val="24"/>
+        </w:rPr>
+        <w:t>Locators:</w:t>
+      </w:r>
+    </w:p>
+    <w:p>
+      <w:pPr>
+        <w:rPr>
+          <w:sz w:val="28"/>
+          <w:szCs w:val="24"/>
+        </w:rPr>
+      </w:pPr>
+      <w:r>
+        <w:rPr>
+          <w:sz w:val="28"/>
+          <w:szCs w:val="24"/>
+        </w:rPr>
+        <w:t>Locator is the strategy / way of locating any control / WebElement on the web page.</w:t>
+      </w:r>
+    </w:p>
+    <w:p>
+      <w:pPr>
+        <w:pStyle w:val="ListParagraph"/>
+        <w:numPr>
+          <w:ilvl w:val="0"/>
+          <w:numId w:val="3"/>
+        </w:numPr>
+        <w:rPr>
+          <w:rFonts w:asciiTheme="minorHAnsi" w:eastAsiaTheme="minorHAnsi" w:hAnsiTheme="minorHAnsi" w:cstheme="minorHAnsi"/>
+          <w:sz w:val="28"/>
+          <w:szCs w:val="24"/>
+        </w:rPr>
+      </w:pPr>
+      <w:r>
+        <w:rPr>
+          <w:rFonts w:asciiTheme="minorHAnsi" w:eastAsiaTheme="minorHAnsi" w:hAnsiTheme="minorHAnsi" w:cstheme="minorHAnsi"/>
+          <w:sz w:val="28"/>
+          <w:szCs w:val="24"/>
+        </w:rPr>
+        <w:t>getByRole()</w:t>
+      </w:r>
+    </w:p>
+    <w:p>
+      <w:pPr>
+        <w:pStyle w:val="ListParagraph"/>
+        <w:numPr>
+          <w:ilvl w:val="0"/>
+          <w:numId w:val="3"/>
+        </w:numPr>
+        <w:rPr>
+          <w:rFonts w:asciiTheme="minorHAnsi" w:eastAsiaTheme="minorHAnsi" w:hAnsiTheme="minorHAnsi" w:cstheme="minorHAnsi"/>
+          <w:sz w:val="28"/>
+          <w:szCs w:val="24"/>
+        </w:rPr>
+      </w:pPr>
+      <w:r>
+        <w:rPr>
+          <w:rFonts w:asciiTheme="minorHAnsi" w:eastAsiaTheme="minorHAnsi" w:hAnsiTheme="minorHAnsi" w:cstheme="minorHAnsi"/>
+          <w:sz w:val="28"/>
+          <w:szCs w:val="24"/>
+        </w:rPr>
+        <w:t>getByText()</w:t>
+      </w:r>
+    </w:p>
+    <w:p>
+      <w:pPr>
+        <w:pStyle w:val="ListParagraph"/>
+        <w:numPr>
+          <w:ilvl w:val="0"/>
+          <w:numId w:val="3"/>
+        </w:numPr>
+        <w:rPr>
+          <w:rFonts w:asciiTheme="minorHAnsi" w:eastAsiaTheme="minorHAnsi" w:hAnsiTheme="minorHAnsi" w:cstheme="minorHAnsi"/>
+          <w:sz w:val="28"/>
+          <w:szCs w:val="24"/>
+        </w:rPr>
+      </w:pPr>
+      <w:r>
+        <w:rPr>
+          <w:rFonts w:asciiTheme="minorHAnsi" w:eastAsiaTheme="minorHAnsi" w:hAnsiTheme="minorHAnsi" w:cstheme="minorHAnsi"/>
+          <w:sz w:val="28"/>
+          <w:szCs w:val="24"/>
+        </w:rPr>
+        <w:t>getByLabel()</w:t>
+      </w:r>
+    </w:p>
+    <w:p>
+      <w:pPr>
+        <w:pStyle w:val="ListParagraph"/>
+        <w:numPr>
+          <w:ilvl w:val="0"/>
+          <w:numId w:val="3"/>
+        </w:numPr>
+        <w:rPr>
+          <w:rFonts w:asciiTheme="minorHAnsi" w:eastAsiaTheme="minorHAnsi" w:hAnsiTheme="minorHAnsi" w:cstheme="minorHAnsi"/>
+          <w:sz w:val="28"/>
+          <w:szCs w:val="24"/>
+        </w:rPr>
+      </w:pPr>
+      <w:r>
+        <w:rPr>
+          <w:rFonts w:asciiTheme="minorHAnsi" w:eastAsiaTheme="minorHAnsi" w:hAnsiTheme="minorHAnsi" w:cstheme="minorHAnsi"/>
+          <w:sz w:val="28"/>
+          <w:szCs w:val="24"/>
+        </w:rPr>
+        <w:t>getByPlaceholder()</w:t>
+      </w:r>
+    </w:p>
+    <w:p>
+      <w:pPr>
+        <w:pStyle w:val="ListParagraph"/>
+        <w:numPr>
+          <w:ilvl w:val="0"/>
+          <w:numId w:val="3"/>
+        </w:numPr>
+        <w:rPr>
+          <w:rFonts w:asciiTheme="minorHAnsi" w:eastAsiaTheme="minorHAnsi" w:hAnsiTheme="minorHAnsi" w:cstheme="minorHAnsi"/>
+          <w:sz w:val="28"/>
+          <w:szCs w:val="24"/>
+        </w:rPr>
+      </w:pPr>
+      <w:r>
+        <w:rPr>
+          <w:rFonts w:asciiTheme="minorHAnsi" w:eastAsiaTheme="minorHAnsi" w:hAnsiTheme="minorHAnsi" w:cstheme="minorHAnsi"/>
+          <w:sz w:val="28"/>
+          <w:szCs w:val="24"/>
+        </w:rPr>
+        <w:t>getByAltText()</w:t>
+      </w:r>
+    </w:p>
+    <w:p>
+      <w:pPr>
+        <w:pStyle w:val="ListParagraph"/>
+        <w:numPr>
+          <w:ilvl w:val="0"/>
+          <w:numId w:val="3"/>
+        </w:numPr>
+        <w:rPr>
+          <w:rFonts w:asciiTheme="minorHAnsi" w:eastAsiaTheme="minorHAnsi" w:hAnsiTheme="minorHAnsi" w:cstheme="minorHAnsi"/>
+          <w:sz w:val="28"/>
+          <w:szCs w:val="24"/>
+        </w:rPr>
+      </w:pPr>
+      <w:r>
+        <w:rPr>
+          <w:rFonts w:asciiTheme="minorHAnsi" w:eastAsiaTheme="minorHAnsi" w:hAnsiTheme="minorHAnsi" w:cstheme="minorHAnsi"/>
+          <w:sz w:val="28"/>
+          <w:szCs w:val="24"/>
+        </w:rPr>
+        <w:t>getByTitle()</w:t>
+      </w:r>
+    </w:p>
+    <w:p>
+      <w:pPr>
+        <w:pStyle w:val="ListParagraph"/>
+        <w:numPr>
+          <w:ilvl w:val="0"/>
+          <w:numId w:val="3"/>
+        </w:numPr>
+        <w:rPr>
+          <w:rFonts w:asciiTheme="minorHAnsi" w:eastAsiaTheme="minorHAnsi" w:hAnsiTheme="minorHAnsi" w:cstheme="minorHAnsi"/>
+          <w:sz w:val="28"/>
+          <w:szCs w:val="24"/>
+        </w:rPr>
+      </w:pPr>
+      <w:r>
+        <w:rPr>
+          <w:rFonts w:asciiTheme="minorHAnsi" w:eastAsiaTheme="minorHAnsi" w:hAnsiTheme="minorHAnsi" w:cstheme="minorHAnsi"/>
+          <w:sz w:val="28"/>
+          <w:szCs w:val="24"/>
+        </w:rPr>
+        <w:t>getByTestId()</w:t>
+      </w:r>
+    </w:p>
+    <w:p>
+      <w:pPr>
+        <w:pStyle w:val="ListParagraph"/>
+        <w:numPr>
+          <w:ilvl w:val="0"/>
+          <w:numId w:val="3"/>
+        </w:numPr>
+        <w:rPr>
+          <w:rFonts w:asciiTheme="minorHAnsi" w:eastAsiaTheme="minorHAnsi" w:hAnsiTheme="minorHAnsi" w:cstheme="minorHAnsi"/>
+          <w:sz w:val="28"/>
+          <w:szCs w:val="24"/>
+        </w:rPr>
+      </w:pPr>
+      <w:r>
+        <w:rPr>
+          <w:rFonts w:asciiTheme="minorHAnsi" w:eastAsiaTheme="minorHAnsi" w:hAnsiTheme="minorHAnsi" w:cstheme="minorHAnsi"/>
+          <w:sz w:val="28"/>
+          <w:szCs w:val="24"/>
+        </w:rPr>
+        <w:lastRenderedPageBreak/>
+        <w:t>Xpath</w:t>
+      </w:r>
+    </w:p>
+    <w:p>
+      <w:pPr>
+        <w:pStyle w:val="ListParagraph"/>
+        <w:numPr>
+          <w:ilvl w:val="0"/>
+          <w:numId w:val="3"/>
+        </w:numPr>
+        <w:rPr>
+          <w:rFonts w:asciiTheme="minorHAnsi" w:eastAsiaTheme="minorHAnsi" w:hAnsiTheme="minorHAnsi" w:cstheme="minorHAnsi"/>
+          <w:sz w:val="28"/>
+          <w:szCs w:val="24"/>
+        </w:rPr>
+      </w:pPr>
+      <w:r>
+        <w:rPr>
+          <w:rFonts w:asciiTheme="minorHAnsi" w:eastAsiaTheme="minorHAnsi" w:hAnsiTheme="minorHAnsi" w:cstheme="minorHAnsi"/>
+          <w:sz w:val="28"/>
+          <w:szCs w:val="24"/>
+        </w:rPr>
+        <w:t>CssSelector</w:t>
+      </w:r>
+    </w:p>
+    <w:p>
+      <w:pPr>
+        <w:rPr>
+          <w:rFonts w:cstheme="minorHAnsi"/>
+          <w:sz w:val="28"/>
+          <w:szCs w:val="24"/>
+        </w:rPr>
+      </w:pPr>
     </w:p>
     <w:p>
       <w:pPr>
@@ -482,6 +790,95 @@
 <file path=word/numbering.xml><?xml version="1.0" encoding="utf-8"?>
 <w:numbering xmlns:wpc="http://schemas.microsoft.com/office/word/2010/wordprocessingCanvas" xmlns:mc="http://schemas.openxmlformats.org/markup-compatibility/2006" xmlns:o="urn:schemas-microsoft-com:office:office" xmlns:r="http://schemas.openxmlformats.org/officeDocument/2006/relationships" xmlns:m="http://schemas.openxmlformats.org/officeDocument/2006/math" xmlns:v="urn:schemas-microsoft-com:vml" xmlns:wp14="http://schemas.microsoft.com/office/word/2010/wordprocessingDrawing" xmlns:wp="http://schemas.openxmlformats.org/drawingml/2006/wordprocessingDrawing" xmlns:w10="urn:schemas-microsoft-com:office:word" xmlns:w="http://schemas.openxmlformats.org/wordprocessingml/2006/main" xmlns:w14="http://schemas.microsoft.com/office/word/2010/wordml" xmlns:w15="http://schemas.microsoft.com/office/word/2012/wordml" xmlns:wpg="http://schemas.microsoft.com/office/word/2010/wordprocessingGroup" xmlns:wpi="http://schemas.microsoft.com/office/word/2010/wordprocessingInk" xmlns:wne="http://schemas.microsoft.com/office/word/2006/wordml" xmlns:wps="http://schemas.microsoft.com/office/word/2010/wordprocessingShape" mc:Ignorable="w14 w15 wp14">
   <w:abstractNum w:abstractNumId="0">
+    <w:nsid w:val="31DE4036"/>
+    <w:multiLevelType w:val="hybridMultilevel"/>
+    <w:tmpl w:val="DFAC45E8"/>
+    <w:lvl w:ilvl="0" w:tplc="4009000F">
+      <w:start w:val="1"/>
+      <w:numFmt w:val="decimal"/>
+      <w:lvlText w:val="%1."/>
+      <w:lvlJc w:val="left"/>
+      <w:pPr>
+        <w:ind w:left="720" w:hanging="360"/>
+      </w:pPr>
+      <w:rPr>
+        <w:rFonts w:hint="default"/>
+      </w:rPr>
+    </w:lvl>
+    <w:lvl w:ilvl="1" w:tplc="40090019" w:tentative="1">
+      <w:start w:val="1"/>
+      <w:numFmt w:val="lowerLetter"/>
+      <w:lvlText w:val="%2."/>
+      <w:lvlJc w:val="left"/>
+      <w:pPr>
+        <w:ind w:left="1440" w:hanging="360"/>
+      </w:pPr>
+    </w:lvl>
+    <w:lvl w:ilvl="2" w:tplc="4009001B" w:tentative="1">
+      <w:start w:val="1"/>
+      <w:numFmt w:val="lowerRoman"/>
+      <w:lvlText w:val="%3."/>
+      <w:lvlJc w:val="right"/>
+      <w:pPr>
+        <w:ind w:left="2160" w:hanging="180"/>
+      </w:pPr>
+    </w:lvl>
+    <w:lvl w:ilvl="3" w:tplc="4009000F" w:tentative="1">
+      <w:start w:val="1"/>
+      <w:numFmt w:val="decimal"/>
+      <w:lvlText w:val="%4."/>
+      <w:lvlJc w:val="left"/>
+      <w:pPr>
+        <w:ind w:left="2880" w:hanging="360"/>
+      </w:pPr>
+    </w:lvl>
+    <w:lvl w:ilvl="4" w:tplc="40090019" w:tentative="1">
+      <w:start w:val="1"/>
+      <w:numFmt w:val="lowerLetter"/>
+      <w:lvlText w:val="%5."/>
+      <w:lvlJc w:val="left"/>
+      <w:pPr>
+        <w:ind w:left="3600" w:hanging="360"/>
+      </w:pPr>
+    </w:lvl>
+    <w:lvl w:ilvl="5" w:tplc="4009001B" w:tentative="1">
+      <w:start w:val="1"/>
+      <w:numFmt w:val="lowerRoman"/>
+      <w:lvlText w:val="%6."/>
+      <w:lvlJc w:val="right"/>
+      <w:pPr>
+        <w:ind w:left="4320" w:hanging="180"/>
+      </w:pPr>
+    </w:lvl>
+    <w:lvl w:ilvl="6" w:tplc="4009000F" w:tentative="1">
+      <w:start w:val="1"/>
+      <w:numFmt w:val="decimal"/>
+      <w:lvlText w:val="%7."/>
+      <w:lvlJc w:val="left"/>
+      <w:pPr>
+        <w:ind w:left="5040" w:hanging="360"/>
+      </w:pPr>
+    </w:lvl>
+    <w:lvl w:ilvl="7" w:tplc="40090019" w:tentative="1">
+      <w:start w:val="1"/>
+      <w:numFmt w:val="lowerLetter"/>
+      <w:lvlText w:val="%8."/>
+      <w:lvlJc w:val="left"/>
+      <w:pPr>
+        <w:ind w:left="5760" w:hanging="360"/>
+      </w:pPr>
+    </w:lvl>
+    <w:lvl w:ilvl="8" w:tplc="4009001B" w:tentative="1">
+      <w:start w:val="1"/>
+      <w:numFmt w:val="lowerRoman"/>
+      <w:lvlText w:val="%9."/>
+      <w:lvlJc w:val="right"/>
+      <w:pPr>
+        <w:ind w:left="6480" w:hanging="180"/>
+      </w:pPr>
+    </w:lvl>
+  </w:abstractNum>
+  <w:abstractNum w:abstractNumId="1">
     <w:nsid w:val="45424739"/>
     <w:multiLevelType w:val="hybridMultilevel"/>
     <w:tmpl w:val="599E872A"/>
@@ -570,7 +967,7 @@
       </w:pPr>
     </w:lvl>
   </w:abstractNum>
-  <w:abstractNum w:abstractNumId="1">
+  <w:abstractNum w:abstractNumId="2">
     <w:nsid w:val="7C0D4E08"/>
     <w:multiLevelType w:val="hybridMultilevel"/>
     <w:tmpl w:val="B64E822E"/>
@@ -711,9 +1108,12 @@
     </w:lvl>
   </w:abstractNum>
   <w:num w:numId="1">
+    <w:abstractNumId w:val="2"/>
+  </w:num>
+  <w:num w:numId="2">
     <w:abstractNumId w:val="1"/>
   </w:num>
-  <w:num w:numId="2">
+  <w:num w:numId="3">
     <w:abstractNumId w:val="0"/>
   </w:num>
 </w:numbering>
@@ -1118,6 +1518,7 @@
   <w:style w:type="character" w:default="1" w:styleId="DefaultParagraphFont">
     <w:name w:val="Default Paragraph Font"/>
     <w:uiPriority w:val="1"/>
+    <w:semiHidden/>
     <w:unhideWhenUsed/>
   </w:style>
   <w:style w:type="table" w:default="1" w:styleId="TableNormal">

</xml_diff>

<commit_message>
Date: 31 Aug 2026
</commit_message>
<xml_diff>
--- a/Playwright Notes.docx
+++ b/Playwright Notes.docx
@@ -69,57 +69,114 @@
         </w:rPr>
         <w:t xml:space="preserve">1. </w:t>
       </w:r>
-      <w:r>
-        <w:rPr>
-          <w:sz w:val="28"/>
-          <w:szCs w:val="24"/>
-        </w:rPr>
-        <w:t>browser: will execute script on original browser instance (Chrome)</w:t>
-      </w:r>
-    </w:p>
-    <w:p>
-      <w:pPr>
-        <w:rPr>
-          <w:sz w:val="28"/>
-          <w:szCs w:val="24"/>
-        </w:rPr>
-      </w:pPr>
-      <w:r>
-        <w:rPr>
-          <w:sz w:val="28"/>
-          <w:szCs w:val="24"/>
-        </w:rPr>
-        <w:t>2. browser context: multiple browsers for multiple users</w:t>
-      </w:r>
-    </w:p>
-    <w:p>
-      <w:pPr>
-        <w:rPr>
-          <w:sz w:val="28"/>
-          <w:szCs w:val="24"/>
-        </w:rPr>
-      </w:pPr>
-      <w:r>
-        <w:rPr>
-          <w:sz w:val="28"/>
-          <w:szCs w:val="24"/>
-        </w:rPr>
-        <w:t xml:space="preserve">3. page: for single tab / browser </w:t>
-      </w:r>
-    </w:p>
-    <w:p>
-      <w:pPr>
-        <w:rPr>
-          <w:sz w:val="28"/>
-          <w:szCs w:val="24"/>
-        </w:rPr>
-      </w:pPr>
-      <w:r>
-        <w:rPr>
-          <w:sz w:val="28"/>
-          <w:szCs w:val="24"/>
-        </w:rPr>
-        <w:t>4. request: API testing</w:t>
+      <w:proofErr w:type="gramStart"/>
+      <w:r>
+        <w:rPr>
+          <w:sz w:val="28"/>
+          <w:szCs w:val="24"/>
+        </w:rPr>
+        <w:t>browser</w:t>
+      </w:r>
+      <w:proofErr w:type="gramEnd"/>
+      <w:r>
+        <w:rPr>
+          <w:sz w:val="28"/>
+          <w:szCs w:val="24"/>
+        </w:rPr>
+        <w:t>: will execute script on original browser instance (Chrome)</w:t>
+      </w:r>
+    </w:p>
+    <w:p>
+      <w:pPr>
+        <w:rPr>
+          <w:sz w:val="28"/>
+          <w:szCs w:val="24"/>
+        </w:rPr>
+      </w:pPr>
+      <w:r>
+        <w:rPr>
+          <w:sz w:val="28"/>
+          <w:szCs w:val="24"/>
+        </w:rPr>
+        <w:t xml:space="preserve">2. </w:t>
+      </w:r>
+      <w:proofErr w:type="gramStart"/>
+      <w:r>
+        <w:rPr>
+          <w:sz w:val="28"/>
+          <w:szCs w:val="24"/>
+        </w:rPr>
+        <w:t>browser</w:t>
+      </w:r>
+      <w:proofErr w:type="gramEnd"/>
+      <w:r>
+        <w:rPr>
+          <w:sz w:val="28"/>
+          <w:szCs w:val="24"/>
+        </w:rPr>
+        <w:t xml:space="preserve"> context: multiple browsers for multiple users</w:t>
+      </w:r>
+    </w:p>
+    <w:p>
+      <w:pPr>
+        <w:rPr>
+          <w:sz w:val="28"/>
+          <w:szCs w:val="24"/>
+        </w:rPr>
+      </w:pPr>
+      <w:r>
+        <w:rPr>
+          <w:sz w:val="28"/>
+          <w:szCs w:val="24"/>
+        </w:rPr>
+        <w:t xml:space="preserve">3. </w:t>
+      </w:r>
+      <w:proofErr w:type="gramStart"/>
+      <w:r>
+        <w:rPr>
+          <w:sz w:val="28"/>
+          <w:szCs w:val="24"/>
+        </w:rPr>
+        <w:t>page</w:t>
+      </w:r>
+      <w:proofErr w:type="gramEnd"/>
+      <w:r>
+        <w:rPr>
+          <w:sz w:val="28"/>
+          <w:szCs w:val="24"/>
+        </w:rPr>
+        <w:t xml:space="preserve">: for single tab / browser </w:t>
+      </w:r>
+    </w:p>
+    <w:p>
+      <w:pPr>
+        <w:rPr>
+          <w:sz w:val="28"/>
+          <w:szCs w:val="24"/>
+        </w:rPr>
+      </w:pPr>
+      <w:r>
+        <w:rPr>
+          <w:sz w:val="28"/>
+          <w:szCs w:val="24"/>
+        </w:rPr>
+        <w:t xml:space="preserve">4. </w:t>
+      </w:r>
+      <w:proofErr w:type="gramStart"/>
+      <w:r>
+        <w:rPr>
+          <w:sz w:val="28"/>
+          <w:szCs w:val="24"/>
+        </w:rPr>
+        <w:t>request</w:t>
+      </w:r>
+      <w:proofErr w:type="gramEnd"/>
+      <w:r>
+        <w:rPr>
+          <w:sz w:val="28"/>
+          <w:szCs w:val="24"/>
+        </w:rPr>
+        <w:t>: API testing</w:t>
       </w:r>
     </w:p>
     <w:p>
@@ -159,13 +216,23 @@
           <w:lang w:eastAsia="en-US"/>
         </w:rPr>
       </w:pPr>
+      <w:proofErr w:type="spellStart"/>
       <w:r>
         <w:rPr>
           <w:rFonts w:eastAsiaTheme="minorHAnsi"/>
           <w:sz w:val="28"/>
           <w:szCs w:val="24"/>
         </w:rPr>
-        <w:t xml:space="preserve">goto() </w:t>
+        <w:t>goto</w:t>
+      </w:r>
+      <w:proofErr w:type="spellEnd"/>
+      <w:r>
+        <w:rPr>
+          <w:rFonts w:eastAsiaTheme="minorHAnsi"/>
+          <w:sz w:val="28"/>
+          <w:szCs w:val="24"/>
+        </w:rPr>
+        <w:t xml:space="preserve">() </w:t>
       </w:r>
       <w:r>
         <w:rPr>
@@ -249,14 +316,25 @@
           <w:lang w:eastAsia="en-US"/>
         </w:rPr>
       </w:pPr>
-      <w:r>
-        <w:rPr>
-          <w:rFonts w:asciiTheme="minorHAnsi" w:eastAsiaTheme="minorHAnsi" w:hAnsiTheme="minorHAnsi" w:cs="Mangal"/>
-          <w:sz w:val="28"/>
-          <w:szCs w:val="24"/>
-          <w:lang w:eastAsia="en-US"/>
-        </w:rPr>
-        <w:t xml:space="preserve">url() </w:t>
+      <w:proofErr w:type="spellStart"/>
+      <w:r>
+        <w:rPr>
+          <w:rFonts w:asciiTheme="minorHAnsi" w:eastAsiaTheme="minorHAnsi" w:hAnsiTheme="minorHAnsi" w:cs="Mangal"/>
+          <w:sz w:val="28"/>
+          <w:szCs w:val="24"/>
+          <w:lang w:eastAsia="en-US"/>
+        </w:rPr>
+        <w:t>url</w:t>
+      </w:r>
+      <w:proofErr w:type="spellEnd"/>
+      <w:r>
+        <w:rPr>
+          <w:rFonts w:asciiTheme="minorHAnsi" w:eastAsiaTheme="minorHAnsi" w:hAnsiTheme="minorHAnsi" w:cs="Mangal"/>
+          <w:sz w:val="28"/>
+          <w:szCs w:val="24"/>
+          <w:lang w:eastAsia="en-US"/>
+        </w:rPr>
+        <w:t xml:space="preserve">() </w:t>
       </w:r>
       <w:r>
         <w:rPr>
@@ -291,14 +369,25 @@
           <w:lang w:eastAsia="en-US"/>
         </w:rPr>
       </w:pPr>
-      <w:r>
-        <w:rPr>
-          <w:rFonts w:asciiTheme="minorHAnsi" w:eastAsiaTheme="minorHAnsi" w:hAnsiTheme="minorHAnsi" w:cs="Mangal"/>
-          <w:sz w:val="28"/>
-          <w:szCs w:val="24"/>
-          <w:lang w:eastAsia="en-US"/>
-        </w:rPr>
-        <w:t xml:space="preserve">goBack() </w:t>
+      <w:proofErr w:type="spellStart"/>
+      <w:r>
+        <w:rPr>
+          <w:rFonts w:asciiTheme="minorHAnsi" w:eastAsiaTheme="minorHAnsi" w:hAnsiTheme="minorHAnsi" w:cs="Mangal"/>
+          <w:sz w:val="28"/>
+          <w:szCs w:val="24"/>
+          <w:lang w:eastAsia="en-US"/>
+        </w:rPr>
+        <w:t>goBack</w:t>
+      </w:r>
+      <w:proofErr w:type="spellEnd"/>
+      <w:r>
+        <w:rPr>
+          <w:rFonts w:asciiTheme="minorHAnsi" w:eastAsiaTheme="minorHAnsi" w:hAnsiTheme="minorHAnsi" w:cs="Mangal"/>
+          <w:sz w:val="28"/>
+          <w:szCs w:val="24"/>
+          <w:lang w:eastAsia="en-US"/>
+        </w:rPr>
+        <w:t xml:space="preserve">() </w:t>
       </w:r>
       <w:r>
         <w:rPr>
@@ -333,6 +422,7 @@
           <w:lang w:eastAsia="en-US"/>
         </w:rPr>
       </w:pPr>
+      <w:proofErr w:type="spellStart"/>
       <w:r>
         <w:rPr>
           <w:rFonts w:asciiTheme="minorHAnsi" w:eastAsiaTheme="minorHAnsi" w:hAnsiTheme="minorHAnsi" w:cs="Mangal"/>
@@ -349,7 +439,17 @@
           <w:szCs w:val="24"/>
           <w:lang w:eastAsia="en-US"/>
         </w:rPr>
-        <w:t xml:space="preserve">rd() </w:t>
+        <w:t>rd</w:t>
+      </w:r>
+      <w:proofErr w:type="spellEnd"/>
+      <w:r>
+        <w:rPr>
+          <w:rFonts w:asciiTheme="minorHAnsi" w:eastAsiaTheme="minorHAnsi" w:hAnsiTheme="minorHAnsi" w:cs="Mangal"/>
+          <w:sz w:val="28"/>
+          <w:szCs w:val="24"/>
+          <w:lang w:eastAsia="en-US"/>
+        </w:rPr>
+        <w:t xml:space="preserve">() </w:t>
       </w:r>
       <w:r>
         <w:rPr>
@@ -369,8 +469,6 @@
         </w:rPr>
         <w:t xml:space="preserve"> Will navigate one level forwa</w:t>
       </w:r>
-      <w:bookmarkStart w:id="0" w:name="_GoBack"/>
-      <w:bookmarkEnd w:id="0"/>
       <w:r>
         <w:rPr>
           <w:rFonts w:asciiTheme="minorHAnsi" w:eastAsiaTheme="minorHAnsi" w:hAnsiTheme="minorHAnsi" w:cs="Mangal"/>
@@ -574,13 +672,23 @@
           <w:szCs w:val="24"/>
         </w:rPr>
       </w:pPr>
+      <w:proofErr w:type="spellStart"/>
       <w:r>
         <w:rPr>
           <w:rFonts w:asciiTheme="minorHAnsi" w:eastAsiaTheme="minorHAnsi" w:hAnsiTheme="minorHAnsi" w:cstheme="minorHAnsi"/>
           <w:sz w:val="28"/>
           <w:szCs w:val="24"/>
         </w:rPr>
-        <w:t>getByRole()</w:t>
+        <w:t>getByRole</w:t>
+      </w:r>
+      <w:proofErr w:type="spellEnd"/>
+      <w:r>
+        <w:rPr>
+          <w:rFonts w:asciiTheme="minorHAnsi" w:eastAsiaTheme="minorHAnsi" w:hAnsiTheme="minorHAnsi" w:cstheme="minorHAnsi"/>
+          <w:sz w:val="28"/>
+          <w:szCs w:val="24"/>
+        </w:rPr>
+        <w:t>()</w:t>
       </w:r>
     </w:p>
     <w:p>
@@ -596,13 +704,23 @@
           <w:szCs w:val="24"/>
         </w:rPr>
       </w:pPr>
+      <w:proofErr w:type="spellStart"/>
       <w:r>
         <w:rPr>
           <w:rFonts w:asciiTheme="minorHAnsi" w:eastAsiaTheme="minorHAnsi" w:hAnsiTheme="minorHAnsi" w:cstheme="minorHAnsi"/>
           <w:sz w:val="28"/>
           <w:szCs w:val="24"/>
         </w:rPr>
-        <w:t>getByText()</w:t>
+        <w:t>getByText</w:t>
+      </w:r>
+      <w:proofErr w:type="spellEnd"/>
+      <w:r>
+        <w:rPr>
+          <w:rFonts w:asciiTheme="minorHAnsi" w:eastAsiaTheme="minorHAnsi" w:hAnsiTheme="minorHAnsi" w:cstheme="minorHAnsi"/>
+          <w:sz w:val="28"/>
+          <w:szCs w:val="24"/>
+        </w:rPr>
+        <w:t>()</w:t>
       </w:r>
     </w:p>
     <w:p>
@@ -618,13 +736,23 @@
           <w:szCs w:val="24"/>
         </w:rPr>
       </w:pPr>
+      <w:proofErr w:type="spellStart"/>
       <w:r>
         <w:rPr>
           <w:rFonts w:asciiTheme="minorHAnsi" w:eastAsiaTheme="minorHAnsi" w:hAnsiTheme="minorHAnsi" w:cstheme="minorHAnsi"/>
           <w:sz w:val="28"/>
           <w:szCs w:val="24"/>
         </w:rPr>
-        <w:t>getByLabel()</w:t>
+        <w:t>getByLabel</w:t>
+      </w:r>
+      <w:proofErr w:type="spellEnd"/>
+      <w:r>
+        <w:rPr>
+          <w:rFonts w:asciiTheme="minorHAnsi" w:eastAsiaTheme="minorHAnsi" w:hAnsiTheme="minorHAnsi" w:cstheme="minorHAnsi"/>
+          <w:sz w:val="28"/>
+          <w:szCs w:val="24"/>
+        </w:rPr>
+        <w:t>()</w:t>
       </w:r>
     </w:p>
     <w:p>
@@ -640,13 +768,23 @@
           <w:szCs w:val="24"/>
         </w:rPr>
       </w:pPr>
+      <w:proofErr w:type="spellStart"/>
       <w:r>
         <w:rPr>
           <w:rFonts w:asciiTheme="minorHAnsi" w:eastAsiaTheme="minorHAnsi" w:hAnsiTheme="minorHAnsi" w:cstheme="minorHAnsi"/>
           <w:sz w:val="28"/>
           <w:szCs w:val="24"/>
         </w:rPr>
-        <w:t>getByPlaceholder()</w:t>
+        <w:t>getByPlaceholder</w:t>
+      </w:r>
+      <w:proofErr w:type="spellEnd"/>
+      <w:r>
+        <w:rPr>
+          <w:rFonts w:asciiTheme="minorHAnsi" w:eastAsiaTheme="minorHAnsi" w:hAnsiTheme="minorHAnsi" w:cstheme="minorHAnsi"/>
+          <w:sz w:val="28"/>
+          <w:szCs w:val="24"/>
+        </w:rPr>
+        <w:t>()</w:t>
       </w:r>
     </w:p>
     <w:p>
@@ -662,13 +800,23 @@
           <w:szCs w:val="24"/>
         </w:rPr>
       </w:pPr>
+      <w:proofErr w:type="spellStart"/>
       <w:r>
         <w:rPr>
           <w:rFonts w:asciiTheme="minorHAnsi" w:eastAsiaTheme="minorHAnsi" w:hAnsiTheme="minorHAnsi" w:cstheme="minorHAnsi"/>
           <w:sz w:val="28"/>
           <w:szCs w:val="24"/>
         </w:rPr>
-        <w:t>getByAltText()</w:t>
+        <w:t>getByAltText</w:t>
+      </w:r>
+      <w:proofErr w:type="spellEnd"/>
+      <w:r>
+        <w:rPr>
+          <w:rFonts w:asciiTheme="minorHAnsi" w:eastAsiaTheme="minorHAnsi" w:hAnsiTheme="minorHAnsi" w:cstheme="minorHAnsi"/>
+          <w:sz w:val="28"/>
+          <w:szCs w:val="24"/>
+        </w:rPr>
+        <w:t>()</w:t>
       </w:r>
     </w:p>
     <w:p>
@@ -684,13 +832,23 @@
           <w:szCs w:val="24"/>
         </w:rPr>
       </w:pPr>
+      <w:proofErr w:type="spellStart"/>
       <w:r>
         <w:rPr>
           <w:rFonts w:asciiTheme="minorHAnsi" w:eastAsiaTheme="minorHAnsi" w:hAnsiTheme="minorHAnsi" w:cstheme="minorHAnsi"/>
           <w:sz w:val="28"/>
           <w:szCs w:val="24"/>
         </w:rPr>
-        <w:t>getByTitle()</w:t>
+        <w:t>getByTitle</w:t>
+      </w:r>
+      <w:proofErr w:type="spellEnd"/>
+      <w:r>
+        <w:rPr>
+          <w:rFonts w:asciiTheme="minorHAnsi" w:eastAsiaTheme="minorHAnsi" w:hAnsiTheme="minorHAnsi" w:cstheme="minorHAnsi"/>
+          <w:sz w:val="28"/>
+          <w:szCs w:val="24"/>
+        </w:rPr>
+        <w:t>()</w:t>
       </w:r>
     </w:p>
     <w:p>
@@ -706,13 +864,23 @@
           <w:szCs w:val="24"/>
         </w:rPr>
       </w:pPr>
+      <w:proofErr w:type="spellStart"/>
       <w:r>
         <w:rPr>
           <w:rFonts w:asciiTheme="minorHAnsi" w:eastAsiaTheme="minorHAnsi" w:hAnsiTheme="minorHAnsi" w:cstheme="minorHAnsi"/>
           <w:sz w:val="28"/>
           <w:szCs w:val="24"/>
         </w:rPr>
-        <w:t>getByTestId()</w:t>
+        <w:t>getByTestId</w:t>
+      </w:r>
+      <w:proofErr w:type="spellEnd"/>
+      <w:r>
+        <w:rPr>
+          <w:rFonts w:asciiTheme="minorHAnsi" w:eastAsiaTheme="minorHAnsi" w:hAnsiTheme="minorHAnsi" w:cstheme="minorHAnsi"/>
+          <w:sz w:val="28"/>
+          <w:szCs w:val="24"/>
+        </w:rPr>
+        <w:t>()</w:t>
       </w:r>
     </w:p>
     <w:p>
@@ -776,6 +944,311 @@
           <w:szCs w:val="24"/>
         </w:rPr>
       </w:pPr>
+      <w:r>
+        <w:rPr>
+          <w:sz w:val="28"/>
+          <w:szCs w:val="24"/>
+        </w:rPr>
+        <w:t>XPath – XML Path</w:t>
+      </w:r>
+    </w:p>
+    <w:p>
+      <w:pPr>
+        <w:rPr>
+          <w:sz w:val="28"/>
+          <w:szCs w:val="24"/>
+        </w:rPr>
+      </w:pPr>
+      <w:r>
+        <w:rPr>
+          <w:sz w:val="28"/>
+          <w:szCs w:val="24"/>
+        </w:rPr>
+        <w:t xml:space="preserve">Pattankodoli bus stand </w:t>
+      </w:r>
+      <w:r>
+        <w:rPr>
+          <w:sz w:val="28"/>
+          <w:szCs w:val="24"/>
+        </w:rPr>
+        <w:sym w:font="Wingdings" w:char="F0E0"/>
+      </w:r>
+      <w:r>
+        <w:rPr>
+          <w:sz w:val="28"/>
+          <w:szCs w:val="24"/>
+        </w:rPr>
+        <w:t xml:space="preserve"> Take Right turn </w:t>
+      </w:r>
+      <w:r>
+        <w:rPr>
+          <w:sz w:val="28"/>
+          <w:szCs w:val="24"/>
+        </w:rPr>
+        <w:sym w:font="Wingdings" w:char="F0E0"/>
+      </w:r>
+      <w:r>
+        <w:rPr>
+          <w:sz w:val="28"/>
+          <w:szCs w:val="24"/>
+        </w:rPr>
+        <w:t xml:space="preserve"> Hupare Nagar </w:t>
+      </w:r>
+      <w:r>
+        <w:rPr>
+          <w:sz w:val="28"/>
+          <w:szCs w:val="24"/>
+        </w:rPr>
+        <w:sym w:font="Wingdings" w:char="F0E0"/>
+      </w:r>
+      <w:r>
+        <w:rPr>
+          <w:sz w:val="28"/>
+          <w:szCs w:val="24"/>
+        </w:rPr>
+        <w:t xml:space="preserve"> Water Tank </w:t>
+      </w:r>
+      <w:r>
+        <w:rPr>
+          <w:sz w:val="28"/>
+          <w:szCs w:val="24"/>
+        </w:rPr>
+        <w:sym w:font="Wingdings" w:char="F0E0"/>
+      </w:r>
+      <w:r>
+        <w:rPr>
+          <w:sz w:val="28"/>
+          <w:szCs w:val="24"/>
+        </w:rPr>
+        <w:t xml:space="preserve"> Lane no 9 </w:t>
+      </w:r>
+      <w:r>
+        <w:rPr>
+          <w:sz w:val="28"/>
+          <w:szCs w:val="24"/>
+        </w:rPr>
+        <w:sym w:font="Wingdings" w:char="F0E0"/>
+      </w:r>
+      <w:r>
+        <w:rPr>
+          <w:sz w:val="28"/>
+          <w:szCs w:val="24"/>
+        </w:rPr>
+        <w:t xml:space="preserve"> House no 1128</w:t>
+      </w:r>
+    </w:p>
+    <w:p>
+      <w:pPr>
+        <w:rPr>
+          <w:sz w:val="28"/>
+          <w:szCs w:val="24"/>
+        </w:rPr>
+      </w:pPr>
+    </w:p>
+    <w:p>
+      <w:pPr>
+        <w:rPr>
+          <w:rFonts w:cstheme="minorHAnsi"/>
+          <w:sz w:val="28"/>
+          <w:szCs w:val="24"/>
+        </w:rPr>
+      </w:pPr>
+      <w:r>
+        <w:rPr>
+          <w:rFonts w:cstheme="minorHAnsi"/>
+          <w:sz w:val="28"/>
+          <w:szCs w:val="24"/>
+        </w:rPr>
+        <w:t xml:space="preserve">Types: </w:t>
+      </w:r>
+    </w:p>
+    <w:p>
+      <w:pPr>
+        <w:pStyle w:val="ListParagraph"/>
+        <w:numPr>
+          <w:ilvl w:val="0"/>
+          <w:numId w:val="4"/>
+        </w:numPr>
+        <w:rPr>
+          <w:rFonts w:asciiTheme="minorHAnsi" w:hAnsiTheme="minorHAnsi" w:cstheme="minorHAnsi"/>
+          <w:sz w:val="28"/>
+          <w:szCs w:val="24"/>
+        </w:rPr>
+      </w:pPr>
+      <w:r>
+        <w:rPr>
+          <w:rFonts w:asciiTheme="minorHAnsi" w:hAnsiTheme="minorHAnsi" w:cstheme="minorHAnsi"/>
+          <w:sz w:val="28"/>
+          <w:szCs w:val="24"/>
+        </w:rPr>
+        <w:t>Absolute XPath – starts with html</w:t>
+      </w:r>
+    </w:p>
+    <w:p>
+      <w:pPr>
+        <w:pStyle w:val="ListParagraph"/>
+        <w:numPr>
+          <w:ilvl w:val="0"/>
+          <w:numId w:val="4"/>
+        </w:numPr>
+        <w:rPr>
+          <w:rFonts w:asciiTheme="minorHAnsi" w:hAnsiTheme="minorHAnsi" w:cstheme="minorHAnsi"/>
+          <w:sz w:val="28"/>
+          <w:szCs w:val="24"/>
+        </w:rPr>
+      </w:pPr>
+      <w:r>
+        <w:rPr>
+          <w:rFonts w:asciiTheme="minorHAnsi" w:hAnsiTheme="minorHAnsi" w:cstheme="minorHAnsi"/>
+          <w:sz w:val="28"/>
+          <w:szCs w:val="24"/>
+        </w:rPr>
+        <w:t>Relative XPath</w:t>
+      </w:r>
+      <w:r>
+        <w:rPr>
+          <w:rFonts w:asciiTheme="minorHAnsi" w:hAnsiTheme="minorHAnsi" w:cstheme="minorHAnsi"/>
+          <w:sz w:val="28"/>
+          <w:szCs w:val="24"/>
+        </w:rPr>
+        <w:t xml:space="preserve"> – starts with //</w:t>
+      </w:r>
+      <w:r>
+        <w:rPr>
+          <w:rFonts w:asciiTheme="minorHAnsi" w:hAnsiTheme="minorHAnsi" w:cstheme="minorHAnsi"/>
+          <w:sz w:val="28"/>
+          <w:szCs w:val="24"/>
+        </w:rPr>
+        <w:t>tagName</w:t>
+      </w:r>
+    </w:p>
+    <w:p>
+      <w:pPr>
+        <w:rPr>
+          <w:rFonts w:cstheme="minorHAnsi"/>
+          <w:sz w:val="28"/>
+          <w:szCs w:val="24"/>
+        </w:rPr>
+      </w:pPr>
+    </w:p>
+    <w:p>
+      <w:pPr>
+        <w:rPr>
+          <w:rFonts w:cstheme="minorHAnsi"/>
+          <w:sz w:val="28"/>
+          <w:szCs w:val="24"/>
+        </w:rPr>
+      </w:pPr>
+      <w:r>
+        <w:rPr>
+          <w:rFonts w:cstheme="minorHAnsi"/>
+          <w:sz w:val="28"/>
+          <w:szCs w:val="24"/>
+        </w:rPr>
+        <w:t>Methods of XPath</w:t>
+      </w:r>
+    </w:p>
+    <w:p>
+      <w:pPr>
+        <w:pStyle w:val="ListParagraph"/>
+        <w:numPr>
+          <w:ilvl w:val="0"/>
+          <w:numId w:val="5"/>
+        </w:numPr>
+        <w:rPr>
+          <w:rFonts w:asciiTheme="minorHAnsi" w:hAnsiTheme="minorHAnsi" w:cstheme="minorHAnsi"/>
+          <w:sz w:val="28"/>
+          <w:szCs w:val="24"/>
+        </w:rPr>
+      </w:pPr>
+      <w:r>
+        <w:rPr>
+          <w:rFonts w:asciiTheme="minorHAnsi" w:hAnsiTheme="minorHAnsi" w:cstheme="minorHAnsi"/>
+          <w:sz w:val="28"/>
+          <w:szCs w:val="24"/>
+        </w:rPr>
+        <w:t>t</w:t>
+      </w:r>
+      <w:r>
+        <w:rPr>
+          <w:rFonts w:asciiTheme="minorHAnsi" w:hAnsiTheme="minorHAnsi" w:cstheme="minorHAnsi"/>
+          <w:sz w:val="28"/>
+          <w:szCs w:val="24"/>
+        </w:rPr>
+        <w:t>ext()</w:t>
+      </w:r>
+      <w:r>
+        <w:rPr>
+          <w:rFonts w:asciiTheme="minorHAnsi" w:hAnsiTheme="minorHAnsi" w:cstheme="minorHAnsi"/>
+          <w:sz w:val="28"/>
+          <w:szCs w:val="24"/>
+        </w:rPr>
+        <w:t xml:space="preserve"> – locates the control using the text on the control</w:t>
+      </w:r>
+    </w:p>
+    <w:p>
+      <w:pPr>
+        <w:pStyle w:val="ListParagraph"/>
+        <w:numPr>
+          <w:ilvl w:val="0"/>
+          <w:numId w:val="5"/>
+        </w:numPr>
+        <w:rPr>
+          <w:rFonts w:asciiTheme="minorHAnsi" w:hAnsiTheme="minorHAnsi" w:cstheme="minorHAnsi"/>
+          <w:sz w:val="28"/>
+          <w:szCs w:val="24"/>
+        </w:rPr>
+      </w:pPr>
+      <w:r>
+        <w:rPr>
+          <w:rFonts w:asciiTheme="minorHAnsi" w:hAnsiTheme="minorHAnsi" w:cstheme="minorHAnsi"/>
+          <w:sz w:val="28"/>
+          <w:szCs w:val="24"/>
+        </w:rPr>
+        <w:t>normalize-space() – locates the control using the text on it but it ignores the spaces before and after</w:t>
+      </w:r>
+    </w:p>
+    <w:p>
+      <w:pPr>
+        <w:pStyle w:val="ListParagraph"/>
+        <w:numPr>
+          <w:ilvl w:val="0"/>
+          <w:numId w:val="5"/>
+        </w:numPr>
+        <w:rPr>
+          <w:rFonts w:asciiTheme="minorHAnsi" w:hAnsiTheme="minorHAnsi" w:cstheme="minorHAnsi"/>
+          <w:sz w:val="28"/>
+          <w:szCs w:val="24"/>
+        </w:rPr>
+      </w:pPr>
+      <w:proofErr w:type="gramStart"/>
+      <w:r>
+        <w:rPr>
+          <w:rFonts w:asciiTheme="minorHAnsi" w:hAnsiTheme="minorHAnsi" w:cstheme="minorHAnsi"/>
+          <w:sz w:val="28"/>
+          <w:szCs w:val="24"/>
+        </w:rPr>
+        <w:t>contains(</w:t>
+      </w:r>
+      <w:proofErr w:type="gramEnd"/>
+      <w:r>
+        <w:rPr>
+          <w:rFonts w:asciiTheme="minorHAnsi" w:hAnsiTheme="minorHAnsi" w:cstheme="minorHAnsi"/>
+          <w:sz w:val="28"/>
+          <w:szCs w:val="24"/>
+        </w:rPr>
+        <w:t>) – locates the control using any one attribute or text. This method especially</w:t>
+      </w:r>
+      <w:bookmarkStart w:id="0" w:name="_GoBack"/>
+      <w:bookmarkEnd w:id="0"/>
+      <w:r>
+        <w:rPr>
+          <w:rFonts w:asciiTheme="minorHAnsi" w:hAnsiTheme="minorHAnsi" w:cstheme="minorHAnsi"/>
+          <w:sz w:val="28"/>
+          <w:szCs w:val="24"/>
+        </w:rPr>
+        <w:t xml:space="preserve"> used when the attribute or text is dynamic.</w:t>
+      </w:r>
     </w:p>
     <w:sectPr>
       <w:pgSz w:w="11906" w:h="16838"/>
@@ -790,6 +1263,95 @@
 <file path=word/numbering.xml><?xml version="1.0" encoding="utf-8"?>
 <w:numbering xmlns:wpc="http://schemas.microsoft.com/office/word/2010/wordprocessingCanvas" xmlns:mc="http://schemas.openxmlformats.org/markup-compatibility/2006" xmlns:o="urn:schemas-microsoft-com:office:office" xmlns:r="http://schemas.openxmlformats.org/officeDocument/2006/relationships" xmlns:m="http://schemas.openxmlformats.org/officeDocument/2006/math" xmlns:v="urn:schemas-microsoft-com:vml" xmlns:wp14="http://schemas.microsoft.com/office/word/2010/wordprocessingDrawing" xmlns:wp="http://schemas.openxmlformats.org/drawingml/2006/wordprocessingDrawing" xmlns:w10="urn:schemas-microsoft-com:office:word" xmlns:w="http://schemas.openxmlformats.org/wordprocessingml/2006/main" xmlns:w14="http://schemas.microsoft.com/office/word/2010/wordml" xmlns:w15="http://schemas.microsoft.com/office/word/2012/wordml" xmlns:wpg="http://schemas.microsoft.com/office/word/2010/wordprocessingGroup" xmlns:wpi="http://schemas.microsoft.com/office/word/2010/wordprocessingInk" xmlns:wne="http://schemas.microsoft.com/office/word/2006/wordml" xmlns:wps="http://schemas.microsoft.com/office/word/2010/wordprocessingShape" mc:Ignorable="w14 w15 wp14">
   <w:abstractNum w:abstractNumId="0">
+    <w:nsid w:val="13100085"/>
+    <w:multiLevelType w:val="hybridMultilevel"/>
+    <w:tmpl w:val="AC3CF796"/>
+    <w:lvl w:ilvl="0" w:tplc="4009000F">
+      <w:start w:val="1"/>
+      <w:numFmt w:val="decimal"/>
+      <w:lvlText w:val="%1."/>
+      <w:lvlJc w:val="left"/>
+      <w:pPr>
+        <w:ind w:left="720" w:hanging="360"/>
+      </w:pPr>
+      <w:rPr>
+        <w:rFonts w:hint="default"/>
+      </w:rPr>
+    </w:lvl>
+    <w:lvl w:ilvl="1" w:tplc="40090019" w:tentative="1">
+      <w:start w:val="1"/>
+      <w:numFmt w:val="lowerLetter"/>
+      <w:lvlText w:val="%2."/>
+      <w:lvlJc w:val="left"/>
+      <w:pPr>
+        <w:ind w:left="1440" w:hanging="360"/>
+      </w:pPr>
+    </w:lvl>
+    <w:lvl w:ilvl="2" w:tplc="4009001B" w:tentative="1">
+      <w:start w:val="1"/>
+      <w:numFmt w:val="lowerRoman"/>
+      <w:lvlText w:val="%3."/>
+      <w:lvlJc w:val="right"/>
+      <w:pPr>
+        <w:ind w:left="2160" w:hanging="180"/>
+      </w:pPr>
+    </w:lvl>
+    <w:lvl w:ilvl="3" w:tplc="4009000F" w:tentative="1">
+      <w:start w:val="1"/>
+      <w:numFmt w:val="decimal"/>
+      <w:lvlText w:val="%4."/>
+      <w:lvlJc w:val="left"/>
+      <w:pPr>
+        <w:ind w:left="2880" w:hanging="360"/>
+      </w:pPr>
+    </w:lvl>
+    <w:lvl w:ilvl="4" w:tplc="40090019" w:tentative="1">
+      <w:start w:val="1"/>
+      <w:numFmt w:val="lowerLetter"/>
+      <w:lvlText w:val="%5."/>
+      <w:lvlJc w:val="left"/>
+      <w:pPr>
+        <w:ind w:left="3600" w:hanging="360"/>
+      </w:pPr>
+    </w:lvl>
+    <w:lvl w:ilvl="5" w:tplc="4009001B" w:tentative="1">
+      <w:start w:val="1"/>
+      <w:numFmt w:val="lowerRoman"/>
+      <w:lvlText w:val="%6."/>
+      <w:lvlJc w:val="right"/>
+      <w:pPr>
+        <w:ind w:left="4320" w:hanging="180"/>
+      </w:pPr>
+    </w:lvl>
+    <w:lvl w:ilvl="6" w:tplc="4009000F" w:tentative="1">
+      <w:start w:val="1"/>
+      <w:numFmt w:val="decimal"/>
+      <w:lvlText w:val="%7."/>
+      <w:lvlJc w:val="left"/>
+      <w:pPr>
+        <w:ind w:left="5040" w:hanging="360"/>
+      </w:pPr>
+    </w:lvl>
+    <w:lvl w:ilvl="7" w:tplc="40090019" w:tentative="1">
+      <w:start w:val="1"/>
+      <w:numFmt w:val="lowerLetter"/>
+      <w:lvlText w:val="%8."/>
+      <w:lvlJc w:val="left"/>
+      <w:pPr>
+        <w:ind w:left="5760" w:hanging="360"/>
+      </w:pPr>
+    </w:lvl>
+    <w:lvl w:ilvl="8" w:tplc="4009001B" w:tentative="1">
+      <w:start w:val="1"/>
+      <w:numFmt w:val="lowerRoman"/>
+      <w:lvlText w:val="%9."/>
+      <w:lvlJc w:val="right"/>
+      <w:pPr>
+        <w:ind w:left="6480" w:hanging="180"/>
+      </w:pPr>
+    </w:lvl>
+  </w:abstractNum>
+  <w:abstractNum w:abstractNumId="1">
     <w:nsid w:val="31DE4036"/>
     <w:multiLevelType w:val="hybridMultilevel"/>
     <w:tmpl w:val="DFAC45E8"/>
@@ -878,7 +1440,7 @@
       </w:pPr>
     </w:lvl>
   </w:abstractNum>
-  <w:abstractNum w:abstractNumId="1">
+  <w:abstractNum w:abstractNumId="2">
     <w:nsid w:val="45424739"/>
     <w:multiLevelType w:val="hybridMultilevel"/>
     <w:tmpl w:val="599E872A"/>
@@ -967,7 +1529,96 @@
       </w:pPr>
     </w:lvl>
   </w:abstractNum>
-  <w:abstractNum w:abstractNumId="2">
+  <w:abstractNum w:abstractNumId="3">
+    <w:nsid w:val="552E1C86"/>
+    <w:multiLevelType w:val="hybridMultilevel"/>
+    <w:tmpl w:val="AEAEF1CA"/>
+    <w:lvl w:ilvl="0" w:tplc="4009000F">
+      <w:start w:val="1"/>
+      <w:numFmt w:val="decimal"/>
+      <w:lvlText w:val="%1."/>
+      <w:lvlJc w:val="left"/>
+      <w:pPr>
+        <w:ind w:left="720" w:hanging="360"/>
+      </w:pPr>
+      <w:rPr>
+        <w:rFonts w:hint="default"/>
+      </w:rPr>
+    </w:lvl>
+    <w:lvl w:ilvl="1" w:tplc="40090019" w:tentative="1">
+      <w:start w:val="1"/>
+      <w:numFmt w:val="lowerLetter"/>
+      <w:lvlText w:val="%2."/>
+      <w:lvlJc w:val="left"/>
+      <w:pPr>
+        <w:ind w:left="1440" w:hanging="360"/>
+      </w:pPr>
+    </w:lvl>
+    <w:lvl w:ilvl="2" w:tplc="4009001B" w:tentative="1">
+      <w:start w:val="1"/>
+      <w:numFmt w:val="lowerRoman"/>
+      <w:lvlText w:val="%3."/>
+      <w:lvlJc w:val="right"/>
+      <w:pPr>
+        <w:ind w:left="2160" w:hanging="180"/>
+      </w:pPr>
+    </w:lvl>
+    <w:lvl w:ilvl="3" w:tplc="4009000F" w:tentative="1">
+      <w:start w:val="1"/>
+      <w:numFmt w:val="decimal"/>
+      <w:lvlText w:val="%4."/>
+      <w:lvlJc w:val="left"/>
+      <w:pPr>
+        <w:ind w:left="2880" w:hanging="360"/>
+      </w:pPr>
+    </w:lvl>
+    <w:lvl w:ilvl="4" w:tplc="40090019" w:tentative="1">
+      <w:start w:val="1"/>
+      <w:numFmt w:val="lowerLetter"/>
+      <w:lvlText w:val="%5."/>
+      <w:lvlJc w:val="left"/>
+      <w:pPr>
+        <w:ind w:left="3600" w:hanging="360"/>
+      </w:pPr>
+    </w:lvl>
+    <w:lvl w:ilvl="5" w:tplc="4009001B" w:tentative="1">
+      <w:start w:val="1"/>
+      <w:numFmt w:val="lowerRoman"/>
+      <w:lvlText w:val="%6."/>
+      <w:lvlJc w:val="right"/>
+      <w:pPr>
+        <w:ind w:left="4320" w:hanging="180"/>
+      </w:pPr>
+    </w:lvl>
+    <w:lvl w:ilvl="6" w:tplc="4009000F" w:tentative="1">
+      <w:start w:val="1"/>
+      <w:numFmt w:val="decimal"/>
+      <w:lvlText w:val="%7."/>
+      <w:lvlJc w:val="left"/>
+      <w:pPr>
+        <w:ind w:left="5040" w:hanging="360"/>
+      </w:pPr>
+    </w:lvl>
+    <w:lvl w:ilvl="7" w:tplc="40090019" w:tentative="1">
+      <w:start w:val="1"/>
+      <w:numFmt w:val="lowerLetter"/>
+      <w:lvlText w:val="%8."/>
+      <w:lvlJc w:val="left"/>
+      <w:pPr>
+        <w:ind w:left="5760" w:hanging="360"/>
+      </w:pPr>
+    </w:lvl>
+    <w:lvl w:ilvl="8" w:tplc="4009001B" w:tentative="1">
+      <w:start w:val="1"/>
+      <w:numFmt w:val="lowerRoman"/>
+      <w:lvlText w:val="%9."/>
+      <w:lvlJc w:val="right"/>
+      <w:pPr>
+        <w:ind w:left="6480" w:hanging="180"/>
+      </w:pPr>
+    </w:lvl>
+  </w:abstractNum>
+  <w:abstractNum w:abstractNumId="4">
     <w:nsid w:val="7C0D4E08"/>
     <w:multiLevelType w:val="hybridMultilevel"/>
     <w:tmpl w:val="B64E822E"/>
@@ -1108,13 +1759,19 @@
     </w:lvl>
   </w:abstractNum>
   <w:num w:numId="1">
+    <w:abstractNumId w:val="4"/>
+  </w:num>
+  <w:num w:numId="2">
     <w:abstractNumId w:val="2"/>
   </w:num>
-  <w:num w:numId="2">
+  <w:num w:numId="3">
     <w:abstractNumId w:val="1"/>
   </w:num>
-  <w:num w:numId="3">
+  <w:num w:numId="4">
     <w:abstractNumId w:val="0"/>
+  </w:num>
+  <w:num w:numId="5">
+    <w:abstractNumId w:val="3"/>
   </w:num>
 </w:numbering>
 </file>

</xml_diff>